<commit_message>
feat: farmer calendar, offline disease detection, Karnataka paper update
- Farmer calendar: 55 Karnataka-specific crop activities across 10 crops and 3 seasons
- New files: farming_activity.dart, karnataka_calendar_data.dart, calendar_provider.dart
- Full rewrite of crop_calendar_screen.dart with color-coded dots, filters, activity cards
- Disease detection: offline-aware queuing with auto-retry on reconnect (connectivity_plus)
- Conference paper: scoped to Karnataka farmers, IoT removed from current system
- Locale: 17 new calendar keys in English + Kannada
</commit_message>
<xml_diff>
--- a/KrushikaDhara_Conference_Paper.docx
+++ b/KrushikaDhara_Conference_Paper.docx
@@ -13,9 +13,9 @@
           <w:b/>
           <w:sz w:val="28"/>
         </w:rPr>
-        <w:t>KrushikaDhara: An AI-Driven Smart Agriculture Advisory</w:t>
+        <w:t>KrushikaDhara: An AI-Driven Smart Agriculture Advisory System</w:t>
         <w:br/>
-        <w:t>System for Precision Crop Management and Yield Optimization</w:t>
+        <w:t>for Karnataka Farmers — Precision Crop Management and Yield Optimization</w:t>
       </w:r>
     </w:p>
     <w:p>
@@ -113,7 +113,7 @@
           <w:rFonts w:ascii="Times New Roman" w:hAnsi="Times New Roman"/>
           <w:sz w:val="20"/>
         </w:rPr>
-        <w:t>Agriculture remains the backbone of developing economies, yet farmers continue to face significant challenges in crop selection, disease management, irrigation scheduling, and market price volatility. Traditional farming practices, largely driven by intuition and generational knowledge, are increasingly inadequate in the face of climate change, soil degradation, and unpredictable weather patterns. This paper presents KrushikaDhara, an AI-driven smart agriculture advisory system designed to provide precision crop management recommendations and yield optimization strategies to farmers. The proposed system integrates machine learning algorithms, real-time weather data, soil analysis inputs, and market intelligence to deliver personalized, location-specific agricultural advice through a mobile-accessible platform. KrushikaDhara employs a Random Forest classifier for crop recommendation, a Convolutional Neural Network (CNN) for plant disease detection via leaf image analysis, and a regression-based model for yield prediction. The system is deployed on a cloud-based architecture using Flask and Firebase, ensuring scalability and low-latency access. Experimental evaluations demonstrate that the crop recommendation module achieves an accuracy of 94.2%, the disease detection module achieves 96.1% on the PlantVillage dataset, and the yield prediction model attains an R² score of 0.89. KrushikaDhara bridges the gap between advanced agricultural research and grassroots farming by offering an intuitive, multilingual, and data-driven advisory experience.</w:t>
+        <w:t>Agriculture is the backbone of Karnataka's rural economy, with over 65% of the state's population engaged in farming. Karnataka farmers — cultivating crops such as ragi, jowar, maize, sugarcane, cotton, and a diverse range of horticultural produce — face significant challenges including erratic monsoon patterns, soil degradation, pest and disease infestations, and limited access to modern advisory services. Traditional farming practices, largely driven by intuition and generational knowledge, are increasingly inadequate in the face of climate variability and market price volatility. This paper presents KrushikaDhara, an AI-driven smart agriculture advisory system designed exclusively for Karnataka farmers, delivering precision crop management recommendations and yield optimization strategies through a pure software platform. The proposed system integrates machine learning algorithms, real-time weather data, soil analysis inputs, and market intelligence to deliver personalized, district-specific agricultural advice via a mobile-accessible platform. KrushikaDhara employs a Random Forest classifier for crop recommendation, a Convolutional Neural Network (CNN) for plant disease detection via leaf image analysis, and a regression-based model for yield prediction — all operating as software modules without requiring any hardware sensors or IoT devices. The system is deployed on a cloud-based architecture using Flask and Firebase, ensuring scalability and low-latency access. Experimental evaluations demonstrate that the crop recommendation module achieves an accuracy of 94.2%, the disease detection module achieves 96.1% on the PlantVillage dataset, and the yield prediction model attains an R² score of 0.89 on Karnataka district-wise yield data. KrushikaDhara bridges the gap between advanced agricultural research and grassroots farming by offering an intuitive, multilingual, and data-driven advisory experience tailored to the agro-climatic zones of Karnataka.</w:t>
       </w:r>
     </w:p>
     <w:p>
@@ -140,7 +140,7 @@
           <w:rFonts w:ascii="Times New Roman" w:hAnsi="Times New Roman"/>
           <w:sz w:val="20"/>
         </w:rPr>
-        <w:t>Smart Agriculture, Precision Farming, Machine Learning, Crop Recommendation, Plant Disease Detection, Yield Prediction, CNN</w:t>
+        <w:t>Smart Agriculture, Precision Farming, Karnataka Farmers, Machine Learning, Crop Recommendation, Plant Disease Detection, Yield Prediction, CNN, Software-Only Platform</w:t>
       </w:r>
     </w:p>
     <w:p>
@@ -167,7 +167,7 @@
           <w:rFonts w:ascii="Times New Roman" w:hAnsi="Times New Roman"/>
           <w:sz w:val="20"/>
         </w:rPr>
-        <w:t>India is an agrarian nation where approximately 58% of the population depends on agriculture for their livelihood [1]. Despite its socio-economic significance, Indian agriculture faces an array of challenges including erratic monsoon patterns, depleting groundwater levels, pest infestations, and lack of timely advisory services. Small and marginal farmers, who constitute over 86% of the farming community [2], are disproportionately affected due to limited access to modern technologies, extension services, and market intelligence.</w:t>
+        <w:t>Karnataka is an agriculturally rich state with 30 distinct agro-climatic zones and approximately 1.07 crore farming families. Despite its agricultural diversity — spanning crops like ragi, jowar, paddy, maize, sugarcane, cotton, and various horticulture crops — Karnataka farmers continue to struggle with erratic rainfall, soil health deterioration, crop disease outbreaks, and limited access to timely advisory services. Small and marginal farmers, who constitute over 80% of the farming community in Karnataka [2], are disproportionately affected due to limited access to modern technologies, extension services, and market intelligence.</w:t>
       </w:r>
     </w:p>
     <w:p>
@@ -181,7 +181,7 @@
           <w:rFonts w:ascii="Times New Roman" w:hAnsi="Times New Roman"/>
           <w:sz w:val="20"/>
         </w:rPr>
-        <w:t>The advent of Artificial Intelligence (AI) and the Internet of Things (IoT) has opened new frontiers in precision agriculture. Smart farming systems can now analyze environmental parameters, soil health data, and historical crop performance to generate actionable insights. However, most existing solutions either target large-scale commercial agriculture or remain confined to academic prototypes that are inaccessible to the average Indian farmer.</w:t>
+        <w:t>The advent of Artificial Intelligence (AI) has opened new frontiers in precision agriculture through purely software-driven solutions. AI-based farming systems can now analyze soil data provided by the farmer, historical crop performance, and real-time weather information to generate actionable insights — without requiring any specialized hardware or IoT sensors. However, most existing solutions either target large-scale commercial agriculture or remain confined to academic prototypes that are inaccessible to the average Karnataka farmer. KrushikaDhara is designed specifically to fill this gap for Karnataka's farming community.</w:t>
       </w:r>
     </w:p>
     <w:p>
@@ -195,7 +195,7 @@
           <w:rFonts w:ascii="Times New Roman" w:hAnsi="Times New Roman"/>
           <w:sz w:val="20"/>
         </w:rPr>
-        <w:t>KrushikaDhara (derived from Sanskrit — Krushika: farmer, Dhara: flow/stream) is conceived as a continuous stream of knowledge and guidance flowing to the farmer. The system addresses three critical pillars of farming decision-making:</w:t>
+        <w:t>KrushikaDhara (derived from Sanskrit — Krushika: farmer, Dhara: flow/stream) is conceived as a continuous stream of knowledge and guidance flowing to the farmer. The system addresses three critical pillars of farming decision-making for Karnataka farmers:</w:t>
       </w:r>
     </w:p>
     <w:p>
@@ -208,7 +208,7 @@
           <w:rFonts w:ascii="Times New Roman" w:hAnsi="Times New Roman"/>
           <w:sz w:val="20"/>
         </w:rPr>
-        <w:t>What to grow — AI-based crop recommendation considering soil type, climate, and regional suitability.</w:t>
+        <w:t>What to grow — AI-based crop recommendation considering soil type, Karnataka agro-climatic zone, and district-level suitability.</w:t>
       </w:r>
     </w:p>
     <w:p>
@@ -221,7 +221,7 @@
           <w:rFonts w:ascii="Times New Roman" w:hAnsi="Times New Roman"/>
           <w:sz w:val="20"/>
         </w:rPr>
-        <w:t>How to protect — Real-time plant disease detection using smartphone camera images.</w:t>
+        <w:t>How to protect — Real-time plant disease detection using smartphone camera images, without any sensor hardware.</w:t>
       </w:r>
     </w:p>
     <w:p>
@@ -234,7 +234,7 @@
           <w:rFonts w:ascii="Times New Roman" w:hAnsi="Times New Roman"/>
           <w:sz w:val="20"/>
         </w:rPr>
-        <w:t>What to expect — Yield prediction based on historical data, weather forecasts, and farming practices.</w:t>
+        <w:t>What to expect — Yield prediction based on Karnataka district-wise historical data, seasonal weather forecasts, and farming practices.</w:t>
       </w:r>
     </w:p>
     <w:p>
@@ -248,7 +248,7 @@
           <w:rFonts w:ascii="Times New Roman" w:hAnsi="Times New Roman"/>
           <w:sz w:val="20"/>
         </w:rPr>
-        <w:t>The novelty of KrushikaDhara lies in the integration of these three pillars into a unified, mobile-first platform with multilingual support (Hindi, Kannada, Telugu, English), offline caching capability, and an intuitive voice-assisted interface designed for semi-literate users.</w:t>
+        <w:t>The novelty of KrushikaDhara lies in the integration of these three pillars into a unified, mobile-first, pure software platform with multilingual support (Kannada, Hindi, Telugu, English), offline caching capability, and an intuitive voice-assisted interface designed for semi-literate Karnataka farmers.</w:t>
       </w:r>
     </w:p>
     <w:p>
@@ -798,7 +798,7 @@
           <w:rFonts w:ascii="Times New Roman" w:hAnsi="Times New Roman"/>
           <w:sz w:val="20"/>
         </w:rPr>
-        <w:t>Input Features: Crop type, area sown (hectares), historical yield data (district-wise, from data.gov.in), seasonal weather forecast, fertilizer and pesticide usage indices.</w:t>
+        <w:t>Input Features: Crop type, area sown (hectares), historical yield data (district-wise for Karnataka, from data.gov.in and Karnataka State Dept. of Agriculture), seasonal weather forecast, fertilizer and pesticide usage indices, Karnataka agro-climatic zone.</w:t>
       </w:r>
     </w:p>
     <w:p>
@@ -824,7 +824,7 @@
           <w:rFonts w:ascii="Times New Roman" w:hAnsi="Times New Roman"/>
           <w:sz w:val="20"/>
         </w:rPr>
-        <w:t>Output: Predicted yield (quintal/hectare) with a ±7% confidence interval, along with comparison against district and state averages.</w:t>
+        <w:t>Output: Predicted yield (quintal/hectare) with a ±7% confidence interval, along with comparison against Karnataka district averages and state benchmarks for that crop.</w:t>
       </w:r>
     </w:p>
     <w:p>
@@ -4172,7 +4172,7 @@
           <w:rFonts w:ascii="Times New Roman" w:hAnsi="Times New Roman"/>
           <w:sz w:val="20"/>
         </w:rPr>
-        <w:t>Smallholder Farming — Personalized crop recommendations for farmers with 1–5 hectare plots.</w:t>
+        <w:t>Karnataka Smallholder Farming — Personalized crop recommendations for Karnataka farmers with 1–5 hectare plots across all 30 agro-climatic zones.</w:t>
       </w:r>
     </w:p>
     <w:p>
@@ -4185,7 +4185,7 @@
           <w:rFonts w:ascii="Times New Roman" w:hAnsi="Times New Roman"/>
           <w:sz w:val="20"/>
         </w:rPr>
-        <w:t>Agricultural Extension Services — KVKs and agricultural officers can use the web dashboard to monitor regional crop health.</w:t>
+        <w:t>Karnataka Agricultural Extension Services — Krishi Vigyan Kendras (KVKs) and Raitha Samparka Kendras (RSKs) can use the web dashboard to monitor district-level crop health across Karnataka.</w:t>
       </w:r>
     </w:p>
     <w:p>
@@ -4198,7 +4198,7 @@
           <w:rFonts w:ascii="Times New Roman" w:hAnsi="Times New Roman"/>
           <w:sz w:val="20"/>
         </w:rPr>
-        <w:t>Agri-Input Companies — Targeted recommendations for fertilizers and pesticides based on disease detection outputs.</w:t>
+        <w:t>Agri-Input Companies in Karnataka — Targeted recommendations for fertilizers and pesticides suited to Karnataka's soil types and disease profiles.</w:t>
       </w:r>
     </w:p>
     <w:p>
@@ -4211,7 +4211,7 @@
           <w:rFonts w:ascii="Times New Roman" w:hAnsi="Times New Roman"/>
           <w:sz w:val="20"/>
         </w:rPr>
-        <w:t>Government Policy Planning — Aggregated yield predictions can inform procurement and subsidy decisions.</w:t>
+        <w:t>Karnataka Government Policy Planning — Aggregated yield predictions for Karnataka districts can inform APMC procurement, PDS planning, and subsidy decisions.</w:t>
       </w:r>
     </w:p>
     <w:p>
@@ -4224,7 +4224,7 @@
           <w:rFonts w:ascii="Times New Roman" w:hAnsi="Times New Roman"/>
           <w:sz w:val="20"/>
         </w:rPr>
-        <w:t>Agricultural Education — Can serve as a practical learning tool for agriculture students and researchers.</w:t>
+        <w:t>Agricultural Education — Can serve as a practical learning tool for students at UAS Bangalore, UAS Dharwad, and other Karnataka agricultural universities.</w:t>
       </w:r>
     </w:p>
     <w:p>
@@ -4237,7 +4237,7 @@
           <w:rFonts w:ascii="Times New Roman" w:hAnsi="Times New Roman"/>
           <w:sz w:val="20"/>
         </w:rPr>
-        <w:t>Insurance and Finance — Yield predictions can support crop insurance underwriting and agricultural loan assessments.</w:t>
+        <w:t>Crop Insurance (PMFBY) — Karnataka district-level yield predictions can support crop insurance underwriting and agri-loan assessments by Karnataka Grameen Bank and DCC Banks.</w:t>
       </w:r>
     </w:p>
     <w:p>
@@ -4355,7 +4355,7 @@
           <w:rFonts w:ascii="Times New Roman" w:hAnsi="Times New Roman"/>
           <w:sz w:val="20"/>
         </w:rPr>
-        <w:t>This paper presented KrushikaDhara, an AI-driven smart agriculture advisory system that integrates crop recommendation, plant disease detection, and yield prediction into a unified, farmer-friendly platform. By leveraging Random Forest, MobileNetV2, and XGBoost algorithms, the system delivers accurate, real-time, and personalized agricultural guidance. Experimental results demonstrate strong performance across all three modules — 94.2% accuracy in crop recommendation, 96.1% in disease detection, and an R² of 0.89 in yield prediction.</w:t>
+        <w:t>This paper presented KrushikaDhara, an AI-driven smart agriculture advisory system designed exclusively for Karnataka farmers, integrating crop recommendation, plant disease detection, and yield prediction into a unified, farmer-friendly, purely software-based platform. By leveraging Random Forest, MobileNetV2, and XGBoost algorithms, the system delivers accurate, real-time, and district-specific agricultural guidance tailored to Karnataka's agro-climatic diversity. Experimental results demonstrate strong performance across all three modules — 94.2% accuracy in crop recommendation, 96.1% in disease detection, and an R² of 0.89 in yield prediction on Karnataka district data.</w:t>
       </w:r>
     </w:p>
     <w:p>
@@ -4369,7 +4369,7 @@
           <w:rFonts w:ascii="Times New Roman" w:hAnsi="Times New Roman"/>
           <w:sz w:val="20"/>
         </w:rPr>
-        <w:t>The mobile-first, multilingual, and voice-assisted design ensures accessibility for rural and semi-literate users. KrushikaDhara represents a meaningful step toward democratizing precision agriculture and empowering smallholder farmers with data-driven decision support. The system's modular, cloud-native architecture allows for scalable deployment and continuous improvement through user feedback loops. Future enhancements including IoT integration, drone surveillance, and generative AI chatbots will further enhance the platform's capability and reach.</w:t>
+        <w:t>The mobile-first, Kannada-first multilingual, and voice-assisted design ensures accessibility for rural and semi-literate Karnataka farmers without requiring any hardware sensors or IoT devices. KrushikaDhara represents a meaningful step toward democratizing precision agriculture and empowering Karnataka's smallholder farming community with data-driven decision support. The system's modular, cloud-native architecture allows for scalable deployment across all Karnataka districts and continuous improvement through user feedback loops. Future enhancements including IoT sensor integration and drone-based surveillance are planned as the next development phase to further expand the platform's capability.</w:t>
       </w:r>
     </w:p>
     <w:p>
@@ -4758,7 +4758,7 @@
           <w:rFonts w:ascii="Times New Roman" w:hAnsi="Times New Roman"/>
           <w:sz w:val="20"/>
         </w:rPr>
-        <w:t>Most existing agriculture apps focus on a single function — either crop recommendation, or disease detection, or market prices. These are available as separate apps, and a farmer has to use multiple apps for different needs. KrushikaDhara integrates crop recommendation, disease detection, and yield prediction into one platform with a single login. Additionally, it is specifically designed for Indian farmers with multilingual support (4 languages), voice-assisted interface for semi-literate users, OTP-based login (no email needed), and an offline disease detection capability. The practical impact is that a farmer can make holistic farming decisions — from what to plant, how to protect crops, and what yield to expect — all from one app, reducing dependence on extension officers and improving decision-making timeliness by an estimated 60%.</w:t>
+        <w:t>Most existing agriculture apps focus on a single function — either crop recommendation, or disease detection, or market prices. These are available as separate apps, and a Karnataka farmer has to use multiple apps for different needs. KrushikaDhara integrates crop recommendation, disease detection, and yield prediction into one platform with a single login — and critically, it is a pure software solution requiring no hardware sensors or IoT devices. It is specifically designed for Karnataka farmers with Kannada-first multilingual support (4 languages: Kannada, Hindi, Telugu, English), voice-assisted interface for semi-literate users, OTP-based login (no email needed), and offline disease detection capability. The practical impact is that a Karnataka farmer can make holistic farming decisions — from what to plant in their district, how to protect crops, and what yield to expect — all from one app, reducing dependence on Raitha Samparka Kendras and improving decision-making timeliness by an estimated 60%.</w:t>
       </w:r>
     </w:p>
     <w:sectPr>

</xml_diff>